<commit_message>
Deploy preview for PR 124 🛫
</commit_message>
<xml_diff>
--- a/pr-preview/pr-124/chapters/07-confounding-tracked-changes.docx
+++ b/pr-preview/pr-124/chapters/07-confounding-tracked-changes.docx
@@ -1381,6 +1381,20 @@
               <w:t xml:space="preserve"> </w:t>
             </w:r>
             <w:r>
+              <w:t xml:space="preserve">that does not pass through</w:t>
+            </w:r>
+            <w:r>
+              <w:t xml:space="preserve"> </w:t>
+            </w:r>
+            <m:oMath>
+              <m:r>
+                <m:t>Y</m:t>
+              </m:r>
+            </m:oMath>
+            <w:r>
+              <w:t xml:space="preserve"> </w:t>
+            </w:r>
+            <w:r>
               <w:t xml:space="preserve">and a directed path to</w:t>
             </w:r>
             <w:r>
@@ -9315,7 +9329,21 @@
               <w:t xml:space="preserve">Remark 2</w:t>
             </w:r>
             <w:r>
-              <w:t xml:space="preserve"> (Two Settings in Which the Backdoor Criterion Holds). </w:t>
+              <w:t xml:space="preserve"> (No Confounding, or Confounding That</w:t>
+            </w:r>
+            <w:r>
+              <w:t xml:space="preserve"> </w:t>
+            </w:r>
+            <m:oMath>
+              <m:r>
+                <m:t>L</m:t>
+              </m:r>
+            </m:oMath>
+            <w:r>
+              <w:t xml:space="preserve"> </w:t>
+            </w:r>
+            <w:r>
+              <w:t xml:space="preserve">Removes). </w:t>
             </w:r>
           </w:p>
           <w:p>
@@ -19528,7 +19556,7 @@
               <w:t xml:space="preserve">Remark 9</w:t>
             </w:r>
             <w:r>
-              <w:t xml:space="preserve"> (Confounding Is Absolute; Confounder Is Relative). </w:t>
+              <w:t xml:space="preserve"> (Whether a Variable Is a Confounder Depends on the Adjustment Set). </w:t>
             </w:r>
             <w:r>
               <w:t xml:space="preserve">The structural approach first identifies the sources of confounding (the common causes of treatment and outcome) and then a sufficient adjustment set.</w:t>

</xml_diff>